<commit_message>
add tratamento e inserção de imagem
</commit_message>
<xml_diff>
--- a/template/template_devolucao_celular.docx
+++ b/template/template_devolucao_celular.docx
@@ -955,7 +955,7 @@
     </w:p>
     <w:p>
       <w:pPr>
-        <w:shd w:val="clear" w:color="auto" w:fill="FFFFFF"/>
+        <w:shd w:val="clear" w:color="auto" w:fill="FFFFFF" w:themeFill="background1"/>
         <w:spacing w:line="240" w:lineRule="auto"/>
         <w:rPr>
           <w:rFonts w:ascii="Calibri" w:hAnsi="Calibri" w:eastAsia="Calibri" w:cs="Calibri"/>
@@ -970,6 +970,217 @@
           <w:szCs w:val="24"/>
         </w:rPr>
         <w:t>_________________________________________________</w:t>
+      </w:r>
+    </w:p>
+    <w:p>
+      <w:pPr>
+        <w:shd w:val="clear" w:color="auto" w:fill="FFFFFF" w:themeFill="background1"/>
+        <w:spacing w:line="240" w:lineRule="auto"/>
+        <w:rPr>
+          <w:rFonts w:ascii="Calibri" w:hAnsi="Calibri" w:eastAsia="Calibri" w:cs="Calibri"/>
+          <w:sz w:val="24"/>
+          <w:szCs w:val="24"/>
+        </w:rPr>
+      </w:pPr>
+    </w:p>
+    <w:p>
+      <w:pPr>
+        <w:shd w:val="clear" w:color="auto" w:fill="FFFFFF" w:themeFill="background1"/>
+        <w:spacing w:line="240" w:lineRule="auto"/>
+        <w:rPr>
+          <w:rFonts w:ascii="Calibri" w:hAnsi="Calibri" w:eastAsia="Calibri" w:cs="Calibri"/>
+          <w:sz w:val="24"/>
+          <w:szCs w:val="24"/>
+        </w:rPr>
+      </w:pPr>
+    </w:p>
+    <w:p>
+      <w:pPr>
+        <w:shd w:val="clear" w:color="auto" w:fill="FFFFFF" w:themeFill="background1"/>
+        <w:spacing w:line="240" w:lineRule="auto"/>
+        <w:rPr>
+          <w:rFonts w:ascii="Calibri" w:hAnsi="Calibri" w:eastAsia="Calibri" w:cs="Calibri"/>
+          <w:sz w:val="24"/>
+          <w:szCs w:val="24"/>
+        </w:rPr>
+      </w:pPr>
+    </w:p>
+    <w:p>
+      <w:pPr>
+        <w:shd w:val="clear" w:color="auto" w:fill="FFFFFF" w:themeFill="background1"/>
+        <w:spacing w:line="240" w:lineRule="auto"/>
+        <w:rPr>
+          <w:rFonts w:ascii="Calibri" w:hAnsi="Calibri" w:eastAsia="Calibri" w:cs="Calibri"/>
+          <w:sz w:val="24"/>
+          <w:szCs w:val="24"/>
+        </w:rPr>
+      </w:pPr>
+    </w:p>
+    <w:p>
+      <w:pPr>
+        <w:shd w:val="clear" w:color="auto" w:fill="FFFFFF" w:themeFill="background1"/>
+        <w:spacing w:line="240" w:lineRule="auto"/>
+        <w:rPr>
+          <w:rFonts w:ascii="Calibri" w:hAnsi="Calibri" w:eastAsia="Calibri" w:cs="Calibri"/>
+          <w:sz w:val="24"/>
+          <w:szCs w:val="24"/>
+        </w:rPr>
+      </w:pPr>
+    </w:p>
+    <w:p>
+      <w:pPr>
+        <w:shd w:val="clear" w:color="auto" w:fill="FFFFFF" w:themeFill="background1"/>
+        <w:spacing w:line="240" w:lineRule="auto"/>
+        <w:rPr>
+          <w:rFonts w:ascii="Calibri" w:hAnsi="Calibri" w:eastAsia="Calibri" w:cs="Calibri"/>
+          <w:sz w:val="24"/>
+          <w:szCs w:val="24"/>
+        </w:rPr>
+      </w:pPr>
+    </w:p>
+    <w:p>
+      <w:pPr>
+        <w:shd w:val="clear" w:color="auto" w:fill="FFFFFF" w:themeFill="background1"/>
+        <w:spacing w:line="240" w:lineRule="auto"/>
+        <w:rPr>
+          <w:rFonts w:ascii="Calibri" w:hAnsi="Calibri" w:eastAsia="Calibri" w:cs="Calibri"/>
+          <w:sz w:val="24"/>
+          <w:szCs w:val="24"/>
+        </w:rPr>
+      </w:pPr>
+    </w:p>
+    <w:p>
+      <w:pPr>
+        <w:shd w:val="clear" w:color="auto" w:fill="FFFFFF" w:themeFill="background1"/>
+        <w:spacing w:line="240" w:lineRule="auto"/>
+        <w:rPr>
+          <w:rFonts w:ascii="Calibri" w:hAnsi="Calibri" w:eastAsia="Calibri" w:cs="Calibri"/>
+          <w:sz w:val="24"/>
+          <w:szCs w:val="24"/>
+        </w:rPr>
+      </w:pPr>
+    </w:p>
+    <w:p>
+      <w:pPr>
+        <w:shd w:val="clear" w:color="auto" w:fill="FFFFFF" w:themeFill="background1"/>
+        <w:spacing w:line="240" w:lineRule="auto"/>
+        <w:rPr>
+          <w:rFonts w:ascii="Calibri" w:hAnsi="Calibri" w:eastAsia="Calibri" w:cs="Calibri"/>
+          <w:sz w:val="24"/>
+          <w:szCs w:val="24"/>
+        </w:rPr>
+      </w:pPr>
+    </w:p>
+    <w:p>
+      <w:pPr>
+        <w:shd w:val="clear" w:color="auto" w:fill="FFFFFF" w:themeFill="background1"/>
+        <w:spacing w:line="240" w:lineRule="auto"/>
+        <w:rPr>
+          <w:rFonts w:ascii="Calibri" w:hAnsi="Calibri" w:eastAsia="Calibri" w:cs="Calibri"/>
+          <w:sz w:val="24"/>
+          <w:szCs w:val="24"/>
+        </w:rPr>
+      </w:pPr>
+    </w:p>
+    <w:p>
+      <w:pPr>
+        <w:shd w:val="clear" w:color="auto" w:fill="FFFFFF" w:themeFill="background1"/>
+        <w:spacing w:line="240" w:lineRule="auto"/>
+        <w:rPr>
+          <w:rFonts w:ascii="Calibri" w:hAnsi="Calibri" w:eastAsia="Calibri" w:cs="Calibri"/>
+          <w:sz w:val="24"/>
+          <w:szCs w:val="24"/>
+        </w:rPr>
+      </w:pPr>
+    </w:p>
+    <w:p>
+      <w:pPr>
+        <w:shd w:val="clear" w:color="auto" w:fill="FFFFFF" w:themeFill="background1"/>
+        <w:spacing w:line="240" w:lineRule="auto"/>
+        <w:rPr>
+          <w:rFonts w:ascii="Calibri" w:hAnsi="Calibri" w:eastAsia="Calibri" w:cs="Calibri"/>
+          <w:sz w:val="24"/>
+          <w:szCs w:val="24"/>
+        </w:rPr>
+      </w:pPr>
+    </w:p>
+    <w:p>
+      <w:pPr>
+        <w:shd w:val="clear" w:color="auto" w:fill="FFFFFF" w:themeFill="background1"/>
+        <w:spacing w:line="240" w:lineRule="auto"/>
+        <w:rPr>
+          <w:rFonts w:ascii="Calibri" w:hAnsi="Calibri" w:eastAsia="Calibri" w:cs="Calibri"/>
+          <w:sz w:val="24"/>
+          <w:szCs w:val="24"/>
+        </w:rPr>
+      </w:pPr>
+    </w:p>
+    <w:p>
+      <w:pPr>
+        <w:shd w:val="clear" w:color="auto" w:fill="FFFFFF" w:themeFill="background1"/>
+        <w:spacing w:line="240" w:lineRule="auto"/>
+        <w:rPr>
+          <w:rFonts w:ascii="Calibri" w:hAnsi="Calibri" w:eastAsia="Calibri" w:cs="Calibri"/>
+          <w:sz w:val="24"/>
+          <w:szCs w:val="24"/>
+        </w:rPr>
+      </w:pPr>
+    </w:p>
+    <w:p>
+      <w:pPr>
+        <w:pStyle w:val="Normal"/>
+        <w:shd w:val="clear" w:color="auto" w:fill="FFFFFF" w:themeFill="background1"/>
+        <w:spacing w:line="240" w:lineRule="auto"/>
+        <w:ind/>
+        <w:jc w:val="center"/>
+        <w:rPr>
+          <w:rFonts w:ascii="Calibri" w:hAnsi="Calibri" w:eastAsia="Calibri" w:cs="Calibri"/>
+          <w:sz w:val="24"/>
+          <w:szCs w:val="24"/>
+          <w:u w:val="single"/>
+        </w:rPr>
+      </w:pPr>
+      <w:r>
+        <w:rPr>
+          <w:rFonts w:ascii="Calibri" w:hAnsi="Calibri" w:eastAsia="Calibri" w:cs="Calibri"/>
+          <w:sz w:val="24"/>
+          <w:szCs w:val="24"/>
+          <w:u w:val="single"/>
+        </w:rPr>
+        <w:t>{</w:t>
+      </w:r>
+      <w:r>
+        <w:rPr>
+          <w:rFonts w:ascii="Calibri" w:hAnsi="Calibri" w:eastAsia="Calibri" w:cs="Calibri"/>
+          <w:sz w:val="24"/>
+          <w:szCs w:val="24"/>
+          <w:u w:val="single"/>
+        </w:rPr>
+        <w:t>{</w:t>
+      </w:r>
+      <w:r>
+        <w:rPr>
+          <w:rFonts w:ascii="Calibri" w:hAnsi="Calibri" w:eastAsia="Calibri" w:cs="Calibri"/>
+          <w:sz w:val="24"/>
+          <w:szCs w:val="24"/>
+        </w:rPr>
+        <w:t xml:space="preserve"> </w:t>
+      </w:r>
+      <w:r>
+        <w:rPr>
+          <w:rFonts w:ascii="Calibri" w:hAnsi="Calibri" w:eastAsia="Calibri" w:cs="Calibri"/>
+          <w:sz w:val="24"/>
+          <w:szCs w:val="24"/>
+        </w:rPr>
+        <w:t>img</w:t>
+      </w:r>
+      <w:r>
+        <w:rPr>
+          <w:rFonts w:ascii="Calibri" w:hAnsi="Calibri" w:eastAsia="Calibri" w:cs="Calibri"/>
+          <w:sz w:val="24"/>
+          <w:szCs w:val="24"/>
+        </w:rPr>
+        <w:t xml:space="preserve"> }}</w:t>
       </w:r>
     </w:p>
     <w:sectPr>

</xml_diff>